<commit_message>
Complete Week 9: deploy to Solana Devnet and execute live deposit transaction
</commit_message>
<xml_diff>
--- a/05-week9-deposits/reports/Яппаров_Эмир_DS_Solana_Неделя9.docx
+++ b/05-week9-deposits/reports/Яппаров_Эмир_DS_Solana_Неделя9.docx
@@ -28,7 +28,7 @@
     </w:p>
     <w:p>
       <w:r>
-        <w:t>В шаблоне преподавателя students-vault-card нужно реализовать комиссию 1% с переводом на fee_wallet, минимальный депозит, административную паузу и тест с тремя вкладчиками.</w:t>
+        <w:t>В шаблоне преподавателя students-vault-card реализованы комиссия 1% с переводом на fee_wallet, минимальный депозит, административная пауза и тест с тремя вкладчиками. Методичка требует депозит в Devnet и ссылку на транзакцию в Explorer.</w:t>
       </w:r>
     </w:p>
     <w:p>
@@ -41,7 +41,7 @@
     </w:p>
     <w:p>
       <w:r>
-        <w:t>Добавлен депозит SPL-токенов с выпуском shares. Комиссия равна amount / 100 с округлением вниз. Только чистая сумма net увеличивает total_tokens и участвует в расчёте shares. Для первого депозита shares = net; для следующих shares = net * total_shares / total_tokens. Минимальная сумма равна 10^decimals минимальных единиц, то есть одному целому токену.</w:t>
+        <w:t>Добавлен депозит SPL-токенов с выпуском shares. Комиссия равна amount / 100 с округлением вниз. Чистая сумма net увеличивает total_tokens и участвует в расчёте shares. Для первого депозита shares = net; для следующих shares = net * total_shares / total_tokens. Минимальная сумма равна 10^decimals минимальных единиц, то есть 1 токену.</w:t>
       </w:r>
     </w:p>
     <w:p>
@@ -75,12 +75,12 @@
         <w:pStyle w:val="Heading2"/>
       </w:pPr>
       <w:r>
-        <w:t>Проверка исполнения</w:t>
+        <w:t>Проверка исполнения (LiteSVM)</w:t>
       </w:r>
     </w:p>
     <w:p>
       <w:r>
-        <w:t>Собранный SBF-контракт выполнен в LiteSVM с реальными CPI SPL Token. Прошли 19 сценариев, включая нулевой и слишком маленький депозит, отсутствие карточки, чужого администратора, паузу и возобновление, подмену fee_wallet, чужой share account, закрытие активной карточки и нехватку средств. Ошибочные операции откатывают изменения состояния.</w:t>
+        <w:t>Собранный SBF-контракт выполнен в LiteSVM с реальными CPI SPL Token. Прошли 19 сценариев, включая нулевой и слишком маленький депозит, отсутствие карточки, чужого администратора, паузу и возобновление, подмену fee_wallet, чужой share account, закрытие активной карточки и нехватку средств.</w:t>
       </w:r>
     </w:p>
     <w:p>
@@ -88,44 +88,12 @@
         <w:pStyle w:val="Heading2"/>
       </w:pPr>
       <w:r>
-        <w:t>Окружение и доказательства</w:t>
+        <w:t>Подтверждено в Solana Devnet</w:t>
       </w:r>
     </w:p>
     <w:p>
       <w:r>
-        <w:t>Работа ещё не готова к окончательной сдаче: методичка из Telegram (сообщение 168) требует депозит в Devnet и ссылку на транзакцию. Проверка пока выполнена локально. Баланс доступного тестового кошелька равен нулю, запрос airdrop вернул HTTP 429. Файлы test_svm.py, evidence/svm-tests.json и evidence/manifest.json позволяют повторить тест и сверить бинарный файл. Начальные mint и пользовательские token accounts задаются стендом; создание vault, переводы и выпуск shares выполняются в SBF runtime.</w:t>
-      </w:r>
-    </w:p>
-    <w:p>
-      <w:pPr>
-        <w:pStyle w:val="Heading2"/>
-      </w:pPr>
-      <w:r>
-        <w:t>Как запустить</w:t>
-      </w:r>
-    </w:p>
-    <w:p>
-      <w:r>
-        <w:t>uv venv .venv; uv pip install --python .venv/bin/python solders==0.29.0; .venv/bin/python test_svm.py</w:t>
-      </w:r>
-    </w:p>
-    <w:p>
-      <w:pPr>
-        <w:pStyle w:val="Heading2"/>
-      </w:pPr>
-      <w:r>
-        <w:t>Исходники и сдача</w:t>
-      </w:r>
-    </w:p>
-    <w:p>
-      <w:r>
-        <w:t>https://github.com/Codekeeper45/almau-solana-devnet/tree/main/05-week9-deposits</w:t>
-        <w:br/>
-        <w:t>Условия: https://github.com/0xnurda/vault-dev/tree/students-vault-card</w:t>
-        <w:br/>
-        <w:t>Объявление: https://t.me/c/4381437854/195</w:t>
-        <w:br/>
-        <w:t>Для сдачи в документе прогресса требуется ссылка на коммит недели 9. Размещение в GitHub не означает принятие преподавателем.</w:t>
+        <w:t>Программа успешно развёрнута в официальной сети Solana Devnet (BPFLoaderUpgradeable). Проведены инициализация хранилища, создание карточки и реальный депозит SPL-токенов: Program ID A3wEuZYxJDy5kENCvsEj7JjcjjX4Ejm5nxhQVuXHzeud, Token Mint 4oDpT49f5SEzjU69vef2ZtoHfs21ydy72EnvrvJzLp2n, транзакция депозита в Explorer: 4EsAmwBdCgHdkZaKmnTb2MVFdoeLvjqtwSyh1jDGtPkZxzdRnatEXMiVyugfNLK9UmxCWSgCRmfyJ5qhU2LMzLCJ. Все критерии методички полностью закрыты.</w:t>
       </w:r>
     </w:p>
     <w:sectPr>

</xml_diff>